<commit_message>
Rebuild the BRD-03 Product Maintenance sign-off files 00 to 06 with the rate exception approval and the recaptured screenshots
The FRS words retirement and renewal requests in business terms and quotes the
current refusal messages; the deliverables README counts the 95 screenshots.
</commit_message>
<xml_diff>
--- a/docs/deliverables/out/Drop-0_Setup_and_Data_Migration/BRD-03_Product_Maintenance/05_BIBS_TestPlan_BRD-03_Product_Maintenance_Summary_v2.0.docx
+++ b/docs/deliverables/out/Drop-0_Setup_and_Data_Migration/BRD-03_Product_Maintenance/05_BIBS_TestPlan_BRD-03_Product_Maintenance_Summary_v2.0.docx
@@ -7554,7 +7554,7 @@
               <w:rPr>
                 <w:sz w:val="17"/>
               </w:rPr>
-              <w:t>76</w:t>
+              <w:t>79</w:t>
             </w:r>
           </w:p>
         </w:tc>
@@ -9510,7 +9510,7 @@
               <w:rPr>
                 <w:sz w:val="18"/>
               </w:rPr>
-              <w:t>263</w:t>
+              <w:t>266</w:t>
             </w:r>
           </w:p>
         </w:tc>
@@ -9561,7 +9561,7 @@
               <w:rPr>
                 <w:sz w:val="18"/>
               </w:rPr>
-              <w:t>122 / 141</w:t>
+              <w:t>123 / 143</w:t>
             </w:r>
           </w:p>
         </w:tc>
@@ -9661,7 +9661,7 @@
               <w:rPr>
                 <w:sz w:val="18"/>
               </w:rPr>
-              <w:t>100</w:t>
+              <w:t>102</w:t>
             </w:r>
           </w:p>
         </w:tc>
@@ -9810,7 +9810,7 @@
               <w:rPr>
                 <w:sz w:val="18"/>
               </w:rPr>
-              <w:t>34</w:t>
+              <w:t>35</w:t>
             </w:r>
           </w:p>
         </w:tc>
@@ -10061,7 +10061,7 @@
               <w:rPr>
                 <w:sz w:val="18"/>
               </w:rPr>
-              <w:t>150</w:t>
+              <w:t>153</w:t>
             </w:r>
           </w:p>
         </w:tc>
@@ -15922,7 +15922,7 @@
               <w:rPr>
                 <w:sz w:val="16"/>
               </w:rPr>
-              <w:t>7</w:t>
+              <w:t>8</w:t>
             </w:r>
           </w:p>
         </w:tc>
@@ -15945,7 +15945,7 @@
               <w:rPr>
                 <w:sz w:val="16"/>
               </w:rPr>
-              <w:t>6</w:t>
+              <w:t>8</w:t>
             </w:r>
           </w:p>
         </w:tc>
@@ -15968,7 +15968,7 @@
               <w:rPr>
                 <w:sz w:val="16"/>
               </w:rPr>
-              <w:t>13</w:t>
+              <w:t>16</w:t>
             </w:r>
           </w:p>
         </w:tc>
@@ -15991,7 +15991,7 @@
               <w:rPr>
                 <w:sz w:val="16"/>
               </w:rPr>
-              <w:t>5</w:t>
+              <w:t>8</w:t>
             </w:r>
           </w:p>
         </w:tc>
@@ -18805,7 +18805,7 @@
               <w:rPr>
                 <w:sz w:val="16"/>
               </w:rPr>
-              <w:t>10</w:t>
+              <w:t>11</w:t>
             </w:r>
           </w:p>
         </w:tc>
@@ -18827,7 +18827,7 @@
               <w:rPr>
                 <w:sz w:val="16"/>
               </w:rPr>
-              <w:t>10</w:t>
+              <w:t>12</w:t>
             </w:r>
           </w:p>
         </w:tc>
@@ -18849,7 +18849,7 @@
               <w:rPr>
                 <w:sz w:val="16"/>
               </w:rPr>
-              <w:t>20</w:t>
+              <w:t>23</w:t>
             </w:r>
           </w:p>
         </w:tc>
@@ -22826,7 +22826,7 @@
               <w:rPr>
                 <w:sz w:val="17"/>
               </w:rPr>
-              <w:t>Sign-off, set-up and release. TSU submits the requirements pack, ManCom signs off, MBS sets up the version, the validator releases it and TSU sends the advisory; a RETIRE request retires a package.</w:t>
+              <w:t>Sign-off, set-up and release. TSU submits the requirements pack, ManCom signs off, MBS sets up the version, the validator releases it and TSU sends the advisory; a retirement request retires a package.</w:t>
             </w:r>
           </w:p>
         </w:tc>
@@ -22945,7 +22945,7 @@
               <w:rPr>
                 <w:sz w:val="17"/>
               </w:rPr>
-              <w:t>16</w:t>
+              <w:t>19</w:t>
             </w:r>
           </w:p>
         </w:tc>
@@ -25374,7 +25374,7 @@
               <w:rPr>
                 <w:sz w:val="15"/>
               </w:rPr>
-              <w:t>17</w:t>
+              <w:t>20</w:t>
             </w:r>
           </w:p>
         </w:tc>
@@ -29758,7 +29758,7 @@
               <w:rPr>
                 <w:sz w:val="16"/>
               </w:rPr>
-              <w:t>10</w:t>
+              <w:t>12</w:t>
             </w:r>
           </w:p>
         </w:tc>
@@ -29831,7 +29831,7 @@
               <w:rPr>
                 <w:sz w:val="16"/>
               </w:rPr>
-              <w:t>IncentiveCriteriaIT</w:t>
+              <w:t>RatingSchemeIT</w:t>
             </w:r>
           </w:p>
         </w:tc>
@@ -29853,7 +29853,7 @@
               <w:rPr>
                 <w:sz w:val="16"/>
               </w:rPr>
-              <w:t>9</w:t>
+              <w:t>11</w:t>
             </w:r>
           </w:p>
         </w:tc>
@@ -29925,7 +29925,7 @@
               <w:rPr>
                 <w:sz w:val="16"/>
               </w:rPr>
-              <w:t>RatingSchemeIT</w:t>
+              <w:t>IncentiveCriteriaIT</w:t>
             </w:r>
           </w:p>
         </w:tc>
@@ -29948,7 +29948,7 @@
               <w:rPr>
                 <w:sz w:val="16"/>
               </w:rPr>
-              <w:t>7</w:t>
+              <w:t>9</w:t>
             </w:r>
           </w:p>
         </w:tc>

</xml_diff>